<commit_message>
docs(bloc4): capture UptimeRobot insérée au §3.4 (Figure 2) — C4.1.2
Monitor keyword sur /api/health : Up, 100 % sur 24 h, 99,95 % sur 7 j,
latence moyenne 635 ms — les cibles du §3.1 sont tenues. L'ancienne
Figure 2 (pipeline) devient Figure 3. 13 pages inchangées, OOXML PASSED.

Co-Authored-By: Claude Fable 5 <noreply@anthropic.com>
</commit_message>
<xml_diff>
--- a/dossier/Dossier_Bloc4_Albion_Helper_v4.docx
+++ b/dossier/Dossier_Bloc4_Albion_Helper_v4.docx
@@ -3579,6 +3579,68 @@
     </w:p>
     <w:p>
       <w:pPr>
+        <w:spacing w:after="60" w:before="120"/>
+        <w:jc w:val="center"/>
+      </w:pPr>
+      <w:r>
+        <w:drawing>
+          <wp:inline distT="0" distB="0" distL="0" distR="0">
+            <wp:extent cx="5580000" cy="3066785"/>
+            <wp:effectExtent t="0" r="0" b="0" l="0"/>
+            <wp:docPr id="41" name="figure-uptimerobot" descr="Tableau de bord UptimeRobot du monitor /api/health" title="Tableau de bord UptimeRobot"/>
+            <wp:cNvGraphicFramePr>
+              <a:graphicFrameLocks xmlns:a="http://schemas.openxmlformats.org/drawingml/2006/main" noChangeAspect="1"/>
+            </wp:cNvGraphicFramePr>
+            <a:graphic xmlns:a="http://schemas.openxmlformats.org/drawingml/2006/main">
+              <a:graphicData uri="http://schemas.openxmlformats.org/drawingml/2006/picture">
+                <pic:pic xmlns:pic="http://schemas.openxmlformats.org/drawingml/2006/picture">
+                  <pic:nvPicPr>
+                    <pic:cNvPr id="0" name="" descr=""/>
+                    <pic:cNvPicPr>
+                      <a:picLocks noChangeAspect="1" noChangeArrowheads="1"/>
+                    </pic:cNvPicPr>
+                  </pic:nvPicPr>
+                  <pic:blipFill>
+                    <a:blip r:embed="rId99" cstate="none"/>
+                    <a:srcRect/>
+                    <a:stretch>
+                      <a:fillRect/>
+                    </a:stretch>
+                  </pic:blipFill>
+                  <pic:spPr bwMode="auto">
+                    <a:xfrm>
+                      <a:off x="0" y="0"/>
+                      <a:ext cx="5580000" cy="3066785"/>
+                    </a:xfrm>
+                    <a:prstGeom prst="rect">
+                      <a:avLst/>
+                    </a:prstGeom>
+                  </pic:spPr>
+                </pic:pic>
+              </a:graphicData>
+            </a:graphic>
+          </wp:inline>
+        </w:drawing>
+      </w:r>
+    </w:p>
+    <w:p>
+      <w:pPr>
+        <w:spacing w:after="150" w:before="50"/>
+        <w:jc w:val="center"/>
+      </w:pPr>
+      <w:r>
+        <w:rPr>
+          <w:i/>
+          <w:iCs/>
+          <w:color w:val="5A4825"/>
+          <w:sz w:val="18"/>
+          <w:szCs w:val="18"/>
+        </w:rPr>
+        <w:t xml:space="preserve">Figure 2 — Monitor UptimeRobot du 14/08/2026 : statut Up, 100 % sur 24 h, disponibilité 99,95 % sur 7 jours, latence moyenne 635 ms — les cibles du §3.1 sont tenues</w:t>
+      </w:r>
+    </w:p>
+    <w:p>
+      <w:pPr>
         <w:spacing w:after="120" w:before="0" w:line="308"/>
         <w:jc w:val="both"/>
       </w:pPr>
@@ -10586,7 +10648,7 @@
           <w:sz w:val="18"/>
           <w:szCs w:val="18"/>
         </w:rPr>
-        <w:t xml:space="preserve">Figure 2 — Le pipeline qui valide chaque correctif : jobs backend et frontend bloquants sur le commit poussé</w:t>
+        <w:t xml:space="preserve">Figure 3 — Le pipeline qui valide chaque correctif : jobs backend et frontend bloquants sur le commit poussé</w:t>
       </w:r>
     </w:p>
     <w:p>

</xml_diff>